<commit_message>
PIL-003: area 1 findings: unreachable Tally reported as unreachable; zero-quantity entries with batches; one date range per request; deterministic sign-check and base currency; unreadable trial balance logged
Co-Authored-By: Claude Opus 5.5 <noreply@anthropic.com>
</commit_message>
<xml_diff>
--- a/docs/export/validation-and-conversion-rules.docx
+++ b/docs/export/validation-and-conversion-rules.docx
@@ -94,7 +94,7 @@
               <w:pStyle w:val="Compact"/>
             </w:pPr>
             <w:r>
-              <w:t xml:space="preserve">1.1</w:t>
+              <w:t xml:space="preserve">1.2</w:t>
             </w:r>
           </w:p>
         </w:tc>
@@ -4102,7 +4102,7 @@
         <w:t xml:space="preserve">ISINTERNAL</w:t>
       </w:r>
       <w:r>
-        <w:t xml:space="preserve">). Stock at a job worker’s godown is in no item balance, Stock Summary or closing stock value; a principal’s stock with us is counted. A Material In/Out moves stock at its line’s godown; its destination godown moves nothing. An entry spread over several godowns becomes one inventory line per godown.</w:t>
+        <w:t xml:space="preserve">). Stock at a job worker’s godown is in no item balance, Stock Summary or closing stock value; a principal’s stock with us is counted. A Material In/Out moves stock at its line’s godown; its destination godown moves nothing. An entry spread over several godowns becomes one inventory line per godown, each going in or out as the entry does; a batch without its own amount gets its share by quantity, so an entry with no quantity of its own whose batches lack amounts stays one line.</w:t>
       </w:r>
     </w:p>
     <w:p>
@@ -8926,6 +8926,41 @@
             </w:pPr>
             <w:r>
               <w:t xml:space="preserve">Change</w:t>
+            </w:r>
+          </w:p>
+        </w:tc>
+      </w:tr>
+      <w:tr>
+        <w:tc>
+          <w:tcPr/>
+          <w:p>
+            <w:pPr>
+              <w:pStyle w:val="Compact"/>
+            </w:pPr>
+            <w:r>
+              <w:t xml:space="preserve">2026-10-19</w:t>
+            </w:r>
+          </w:p>
+        </w:tc>
+        <w:tc>
+          <w:tcPr/>
+          <w:p>
+            <w:pPr>
+              <w:pStyle w:val="Compact"/>
+            </w:pPr>
+            <w:r>
+              <w:t xml:space="preserve">1.2</w:t>
+            </w:r>
+          </w:p>
+        </w:tc>
+        <w:tc>
+          <w:tcPr/>
+          <w:p>
+            <w:pPr>
+              <w:pStyle w:val="Compact"/>
+            </w:pPr>
+            <w:r>
+              <w:t xml:space="preserve">Rule 6.2: entries with no quantity of their own across several godowns.</w:t>
             </w:r>
           </w:p>
         </w:tc>

</xml_diff>

<commit_message>
PIL-003: fix the area 1 findings (unreachable Tally, zero-quantity entries, one date range, deterministic output, logged fallback) (#39)
* PIL-003: area 1 findings: unreachable Tally reported as unreachable; zero-quantity entries with batches; one date range per request; deterministic sign-check and base currency; unreadable trial balance logged

Co-Authored-By: Claude Opus 5.5 <noreply@anthropic.com>

* SEC-009: start the Docker service on the Windows runner when it isn't running

Co-Authored-By: Claude Opus 5.5 <noreply@anthropic.com>

---------

Co-authored-by: Claude Opus 5.5 <noreply@anthropic.com>
</commit_message>
<xml_diff>
--- a/docs/export/validation-and-conversion-rules.docx
+++ b/docs/export/validation-and-conversion-rules.docx
@@ -94,7 +94,7 @@
               <w:pStyle w:val="Compact"/>
             </w:pPr>
             <w:r>
-              <w:t xml:space="preserve">1.1</w:t>
+              <w:t xml:space="preserve">1.2</w:t>
             </w:r>
           </w:p>
         </w:tc>
@@ -4102,7 +4102,7 @@
         <w:t xml:space="preserve">ISINTERNAL</w:t>
       </w:r>
       <w:r>
-        <w:t xml:space="preserve">). Stock at a job worker’s godown is in no item balance, Stock Summary or closing stock value; a principal’s stock with us is counted. A Material In/Out moves stock at its line’s godown; its destination godown moves nothing. An entry spread over several godowns becomes one inventory line per godown.</w:t>
+        <w:t xml:space="preserve">). Stock at a job worker’s godown is in no item balance, Stock Summary or closing stock value; a principal’s stock with us is counted. A Material In/Out moves stock at its line’s godown; its destination godown moves nothing. An entry spread over several godowns becomes one inventory line per godown, each going in or out as the entry does; a batch without its own amount gets its share by quantity, so an entry with no quantity of its own whose batches lack amounts stays one line.</w:t>
       </w:r>
     </w:p>
     <w:p>
@@ -8926,6 +8926,41 @@
             </w:pPr>
             <w:r>
               <w:t xml:space="preserve">Change</w:t>
+            </w:r>
+          </w:p>
+        </w:tc>
+      </w:tr>
+      <w:tr>
+        <w:tc>
+          <w:tcPr/>
+          <w:p>
+            <w:pPr>
+              <w:pStyle w:val="Compact"/>
+            </w:pPr>
+            <w:r>
+              <w:t xml:space="preserve">2026-10-19</w:t>
+            </w:r>
+          </w:p>
+        </w:tc>
+        <w:tc>
+          <w:tcPr/>
+          <w:p>
+            <w:pPr>
+              <w:pStyle w:val="Compact"/>
+            </w:pPr>
+            <w:r>
+              <w:t xml:space="preserve">1.2</w:t>
+            </w:r>
+          </w:p>
+        </w:tc>
+        <w:tc>
+          <w:tcPr/>
+          <w:p>
+            <w:pPr>
+              <w:pStyle w:val="Compact"/>
+            </w:pPr>
+            <w:r>
+              <w:t xml:space="preserve">Rule 6.2: entries with no quantity of their own across several godowns.</w:t>
             </w:r>
           </w:p>
         </w:tc>

</xml_diff>